<commit_message>
docs: cover letter noi ro goi Zenodo co chua ban thao
Form nop hoi bai da cong bo online chua. Cau tra loi that la ROI: repo
GitHub la public va goi Zenodo ma Data Availability tro toi deu chua
main.tex, vi script kiem phai doc bai moi doi chieu duoc tung con so.

O "preprint URL" tren form chi nhan mot duong link nen khong chua duoc
loi giai thich; dan moi cai DOI vao do thi bien tap de hieu nham la nhom
da dang preprint. Noi ro o cover letter, muc Reproducibility, va noi thang
la ban thao chua tung dang len preprint server.

cover_letter.docx dung lai: 624 -> 690 tu.
</commit_message>
<xml_diff>
--- a/paper/paper2_rebuild/NOP_SECURITY_AND_PRIVACY/cover_letter.docx
+++ b/paper/paper2_rebuild/NOP_SECURITY_AND_PRIVACY/cover_letter.docx
@@ -272,6 +272,50 @@
       </w:r>
       <w:r>
         <w:t xml:space="preserve">https://doi.org/10.5281/zenodo.22893683</w:t>
+      </w:r>
+    </w:p>
+    <w:p>
+      <w:pPr>
+        <w:pStyle w:val="BodyText"/>
+      </w:pPr>
+      <w:r>
+        <w:t xml:space="preserve">That archive, and the project repository at</w:t>
+      </w:r>
+      <w:r>
+        <w:t xml:space="preserve"> </w:t>
+      </w:r>
+      <w:r>
+        <w:t xml:space="preserve">https://github.com/anhquan1111/QSVM_NSLKDD, both contain the LaTeX source of</w:t>
+      </w:r>
+      <w:r>
+        <w:t xml:space="preserve"> </w:t>
+      </w:r>
+      <w:r>
+        <w:t xml:space="preserve">this manuscript. They do so because the audit script reads the manuscript in</w:t>
+      </w:r>
+      <w:r>
+        <w:t xml:space="preserve"> </w:t>
+      </w:r>
+      <w:r>
+        <w:t xml:space="preserve">order to check each printed number against the stored records, so the check</w:t>
+      </w:r>
+      <w:r>
+        <w:t xml:space="preserve"> </w:t>
+      </w:r>
+      <w:r>
+        <w:t xml:space="preserve">cannot run without it. We have declared this on the submission form under</w:t>
+      </w:r>
+      <w:r>
+        <w:t xml:space="preserve"> </w:t>
+      </w:r>
+      <w:r>
+        <w:t xml:space="preserve">prior availability. The manuscript itself has not been posted to a preprint</w:t>
+      </w:r>
+      <w:r>
+        <w:t xml:space="preserve"> </w:t>
+      </w:r>
+      <w:r>
+        <w:t xml:space="preserve">server.</w:t>
       </w:r>
     </w:p>
     <w:p>

</xml_diff>